<commit_message>
Trim Artifact 2 portfolio content
</commit_message>
<xml_diff>
--- a/assets/artifact-2/Chaitanya_Artifact_2_Portfolio_Documentation.docx
+++ b/assets/artifact-2/Chaitanya_Artifact_2_Portfolio_Documentation.docx
@@ -554,44 +554,6 @@
                 <w:color w:val="171717"/>
                 <w:sz w:val="20"/>
               </w:rPr>
-              <w:t>Microsoft Word</w:t>
-            </w:r>
-          </w:p>
-        </w:tc>
-        <w:tc>
-          <w:tcPr>
-            <w:tcW w:type="dxa" w:w="4968"/>
-            <w:vAlign w:val="center"/>
-          </w:tcPr>
-          <w:p>
-            <w:r/>
-            <w:r>
-              <w:rPr>
-                <w:rFonts w:ascii="Aptos" w:hAnsi="Aptos"/>
-                <w:b w:val="0"/>
-                <w:color w:val="171717"/>
-                <w:sz w:val="20"/>
-              </w:rPr>
-              <w:t>Prepared and finalized the academic source report.</w:t>
-            </w:r>
-          </w:p>
-        </w:tc>
-      </w:tr>
-      <w:tr>
-        <w:tc>
-          <w:tcPr>
-            <w:tcW w:type="dxa" w:w="4968"/>
-            <w:vAlign w:val="center"/>
-          </w:tcPr>
-          <w:p>
-            <w:r/>
-            <w:r>
-              <w:rPr>
-                <w:rFonts w:ascii="Aptos" w:hAnsi="Aptos"/>
-                <w:b/>
-                <w:color w:val="171717"/>
-                <w:sz w:val="20"/>
-              </w:rPr>
               <w:t>AIML 500 course lesson</w:t>
             </w:r>
           </w:p>
@@ -687,120 +649,6 @@
                 <w:sz w:val="20"/>
               </w:rPr>
               <w:t>Supported the explanation of CNN-based face recognition and learned embeddings.</w:t>
-            </w:r>
-          </w:p>
-        </w:tc>
-      </w:tr>
-      <w:tr>
-        <w:tc>
-          <w:tcPr>
-            <w:tcW w:type="dxa" w:w="4968"/>
-            <w:vAlign w:val="center"/>
-          </w:tcPr>
-          <w:p>
-            <w:r/>
-            <w:r>
-              <w:rPr>
-                <w:rFonts w:ascii="Aptos" w:hAnsi="Aptos"/>
-                <w:b/>
-                <w:color w:val="171717"/>
-                <w:sz w:val="20"/>
-              </w:rPr>
-              <w:t>HTML and CSS</w:t>
-            </w:r>
-          </w:p>
-        </w:tc>
-        <w:tc>
-          <w:tcPr>
-            <w:tcW w:type="dxa" w:w="4968"/>
-            <w:vAlign w:val="center"/>
-          </w:tcPr>
-          <w:p>
-            <w:r/>
-            <w:r>
-              <w:rPr>
-                <w:rFonts w:ascii="Aptos" w:hAnsi="Aptos"/>
-                <w:b w:val="0"/>
-                <w:color w:val="171717"/>
-                <w:sz w:val="20"/>
-              </w:rPr>
-              <w:t>Presented the artifact in a clear, responsive professional layout.</w:t>
-            </w:r>
-          </w:p>
-        </w:tc>
-      </w:tr>
-      <w:tr>
-        <w:tc>
-          <w:tcPr>
-            <w:tcW w:type="dxa" w:w="4968"/>
-            <w:vAlign w:val="center"/>
-          </w:tcPr>
-          <w:p>
-            <w:r/>
-            <w:r>
-              <w:rPr>
-                <w:rFonts w:ascii="Aptos" w:hAnsi="Aptos"/>
-                <w:b/>
-                <w:color w:val="171717"/>
-                <w:sz w:val="20"/>
-              </w:rPr>
-              <w:t>GitHub Pages</w:t>
-            </w:r>
-          </w:p>
-        </w:tc>
-        <w:tc>
-          <w:tcPr>
-            <w:tcW w:type="dxa" w:w="4968"/>
-            <w:vAlign w:val="center"/>
-          </w:tcPr>
-          <w:p>
-            <w:r/>
-            <w:r>
-              <w:rPr>
-                <w:rFonts w:ascii="Aptos" w:hAnsi="Aptos"/>
-                <w:b w:val="0"/>
-                <w:color w:val="171717"/>
-                <w:sz w:val="20"/>
-              </w:rPr>
-              <w:t>Published the artifact and supporting documents at a stable public URL.</w:t>
-            </w:r>
-          </w:p>
-        </w:tc>
-      </w:tr>
-      <w:tr>
-        <w:tc>
-          <w:tcPr>
-            <w:tcW w:type="dxa" w:w="4968"/>
-            <w:vAlign w:val="center"/>
-          </w:tcPr>
-          <w:p>
-            <w:r/>
-            <w:r>
-              <w:rPr>
-                <w:rFonts w:ascii="Aptos" w:hAnsi="Aptos"/>
-                <w:b/>
-                <w:color w:val="171717"/>
-                <w:sz w:val="20"/>
-              </w:rPr>
-              <w:t>Desktop and mobile browser testing</w:t>
-            </w:r>
-          </w:p>
-        </w:tc>
-        <w:tc>
-          <w:tcPr>
-            <w:tcW w:type="dxa" w:w="4968"/>
-            <w:vAlign w:val="center"/>
-          </w:tcPr>
-          <w:p>
-            <w:r/>
-            <w:r>
-              <w:rPr>
-                <w:rFonts w:ascii="Aptos" w:hAnsi="Aptos"/>
-                <w:b w:val="0"/>
-                <w:color w:val="171717"/>
-                <w:sz w:val="20"/>
-              </w:rPr>
-              <w:t>Verified page behavior, links, images, layout, and console status.</w:t>
             </w:r>
           </w:p>
         </w:tc>
@@ -1001,14 +849,6 @@
         <w:pStyle w:val="ListBullet"/>
       </w:pPr>
       <w:r>
-        <w:t>Researching, citing, and qualifying technical claims.</w:t>
-      </w:r>
-    </w:p>
-    <w:p>
-      <w:pPr>
-        <w:pStyle w:val="ListBullet"/>
-      </w:pPr>
-      <w:r>
         <w:t>Revising academic work for a professional portfolio audience.</w:t>
       </w:r>
     </w:p>
@@ -1018,54 +858,6 @@
       </w:pPr>
       <w:r>
         <w:t>Publishing and testing a responsive web artifact.</w:t>
-      </w:r>
-    </w:p>
-    <w:p>
-      <w:pPr>
-        <w:jc w:val="center"/>
-      </w:pPr>
-      <w:r>
-        <w:drawing>
-          <wp:inline xmlns:a="http://schemas.openxmlformats.org/drawingml/2006/main" xmlns:pic="http://schemas.openxmlformats.org/drawingml/2006/picture">
-            <wp:extent cx="5897880" cy="2402840"/>
-            <wp:docPr id="2" name="Picture 2"/>
-            <wp:cNvGraphicFramePr>
-              <a:graphicFrameLocks noChangeAspect="1"/>
-            </wp:cNvGraphicFramePr>
-            <a:graphic>
-              <a:graphicData uri="http://schemas.openxmlformats.org/drawingml/2006/picture">
-                <pic:pic>
-                  <pic:nvPicPr>
-                    <pic:cNvPr id="0" name="skills-demonstrated.jpg"/>
-                    <pic:cNvPicPr/>
-                  </pic:nvPicPr>
-                  <pic:blipFill>
-                    <a:blip r:embed="rId12"/>
-                    <a:stretch>
-                      <a:fillRect/>
-                    </a:stretch>
-                  </pic:blipFill>
-                  <pic:spPr>
-                    <a:xfrm>
-                      <a:off x="0" y="0"/>
-                      <a:ext cx="5897880" cy="2402840"/>
-                    </a:xfrm>
-                    <a:prstGeom prst="rect"/>
-                  </pic:spPr>
-                </pic:pic>
-              </a:graphicData>
-            </a:graphic>
-          </wp:inline>
-        </w:drawing>
-      </w:r>
-    </w:p>
-    <w:p>
-      <w:pPr>
-        <w:pStyle w:val="Caption"/>
-        <w:jc w:val="center"/>
-      </w:pPr>
-      <w:r>
-        <w:t>Figure 2. Skills demonstrated section on the published Artifact 2 page.</w:t>
       </w:r>
     </w:p>
     <w:p>
@@ -1135,137 +927,6 @@
       <w:pPr/>
       <w:r>
         <w:t>A long academic report is useful as evidence but is not always easy to scan online. I retained the full report as a supporting download and built a shorter web presentation that surfaces the objective, key comparison, applications, skills, challenges, and lessons learned.</w:t>
-      </w:r>
-    </w:p>
-    <w:p>
-      <w:pPr>
-        <w:pStyle w:val="Heading1"/>
-      </w:pPr>
-      <w:r>
-        <w:t>Tangible Evidence</w:t>
-      </w:r>
-    </w:p>
-    <w:p>
-      <w:pPr/>
-      <w:r>
-        <w:t>The published page, report, and screenshots below provide direct evidence of the completed work. The final report contains the two case studies, detailed comparison, in-text citations, conclusion, and references. The web artifact presents the same core learning in a concise professional format.</w:t>
-      </w:r>
-    </w:p>
-    <w:p>
-      <w:pPr>
-        <w:jc w:val="center"/>
-      </w:pPr>
-      <w:r>
-        <w:drawing>
-          <wp:inline xmlns:a="http://schemas.openxmlformats.org/drawingml/2006/main" xmlns:pic="http://schemas.openxmlformats.org/drawingml/2006/picture">
-            <wp:extent cx="5897880" cy="1760894"/>
-            <wp:docPr id="3" name="Picture 3"/>
-            <wp:cNvGraphicFramePr>
-              <a:graphicFrameLocks noChangeAspect="1"/>
-            </wp:cNvGraphicFramePr>
-            <a:graphic>
-              <a:graphicData uri="http://schemas.openxmlformats.org/drawingml/2006/picture">
-                <pic:pic>
-                  <pic:nvPicPr>
-                    <pic:cNvPr id="0" name="artifact-2-live-page.jpg"/>
-                    <pic:cNvPicPr/>
-                  </pic:nvPicPr>
-                  <pic:blipFill>
-                    <a:blip r:embed="rId13"/>
-                    <a:stretch>
-                      <a:fillRect/>
-                    </a:stretch>
-                  </pic:blipFill>
-                  <pic:spPr>
-                    <a:xfrm>
-                      <a:off x="0" y="0"/>
-                      <a:ext cx="5897880" cy="1760894"/>
-                    </a:xfrm>
-                    <a:prstGeom prst="rect"/>
-                  </pic:spPr>
-                </pic:pic>
-              </a:graphicData>
-            </a:graphic>
-          </wp:inline>
-        </w:drawing>
-      </w:r>
-    </w:p>
-    <w:p>
-      <w:pPr>
-        <w:pStyle w:val="Caption"/>
-        <w:jc w:val="center"/>
-      </w:pPr>
-      <w:r>
-        <w:t>Figure 3. Published Artifact 2 page with title, overview, navigation, and report link.</w:t>
-      </w:r>
-    </w:p>
-    <w:p>
-      <w:r>
-        <w:br w:type="page"/>
-      </w:r>
-    </w:p>
-    <w:p>
-      <w:pPr>
-        <w:pStyle w:val="Heading1"/>
-      </w:pPr>
-      <w:r>
-        <w:t>Reflection</w:t>
-      </w:r>
-    </w:p>
-    <w:p>
-      <w:pPr>
-        <w:pStyle w:val="Heading2"/>
-      </w:pPr>
-      <w:r>
-        <w:t>Customization for the Audience</w:t>
-      </w:r>
-    </w:p>
-    <w:p>
-      <w:pPr/>
-      <w:r>
-        <w:t>I learned that a portfolio artifact must do more than reproduce a class submission. The academic report provides depth, but the public page needs a visible purpose, quick navigation, concise explanations, evidence, and a clear statement of skills. I therefore retained the report as supporting evidence while designing the web page for faster review by an instructor or professional audience.</w:t>
-      </w:r>
-    </w:p>
-    <w:p>
-      <w:pPr>
-        <w:pStyle w:val="Heading2"/>
-      </w:pPr>
-      <w:r>
-        <w:t>Lessons Learned</w:t>
-      </w:r>
-    </w:p>
-    <w:p>
-      <w:pPr/>
-      <w:r>
-        <w:t>The main technical lesson was that greater model complexity does not automatically produce a better solution. Logistic regression is valuable when inputs can be structured and the output is binary, while CNNs are valuable when useful visual features must be learned from raw data. I also learned that technical communication requires careful boundaries: a real product may illustrate an application, but that does not prove which exact model runs inside it.</w:t>
-      </w:r>
-    </w:p>
-    <w:p>
-      <w:pPr>
-        <w:pStyle w:val="Heading2"/>
-      </w:pPr>
-      <w:r>
-        <w:t>Review Input and Revisions</w:t>
-      </w:r>
-    </w:p>
-    <w:p>
-      <w:pPr/>
-      <w:r>
-        <w:t>No formal instructor feedback had been received when this portfolio version was completed. I therefore used the assignment instructions, rubric criteria, source verification, and structured self-review as revision inputs. Those checks led me to make the artifact’s title, objective, process, tools, value proposition, evidence, audience customization, lessons, challenges, and revisions explicit. I also added direct links to both the documentation and the finalized report and tested the live page at desktop and mobile sizes.</w:t>
-      </w:r>
-    </w:p>
-    <w:p>
-      <w:pPr>
-        <w:pStyle w:val="Heading2"/>
-      </w:pPr>
-      <w:r>
-        <w:t>Future Improvements</w:t>
-      </w:r>
-    </w:p>
-    <w:p>
-      <w:pPr/>
-      <w:r>
-        <w:t>A future revision could add a small original dataset demonstration, train baseline logistic-regression and CNN models, report evaluation metrics, and compare performance, resource use, and error patterns. That would extend the artifact from a concept-and-application comparison into an empirical model comparison while preserving the current explanation as context.</w:t>
       </w:r>
     </w:p>
     <w:p>

</xml_diff>

<commit_message>
Restore Artifact 2 documentation files
</commit_message>
<xml_diff>
--- a/assets/artifact-2/Chaitanya_Artifact_2_Portfolio_Documentation.docx
+++ b/assets/artifact-2/Chaitanya_Artifact_2_Portfolio_Documentation.docx
@@ -554,6 +554,44 @@
                 <w:color w:val="171717"/>
                 <w:sz w:val="20"/>
               </w:rPr>
+              <w:t>Microsoft Word</w:t>
+            </w:r>
+          </w:p>
+        </w:tc>
+        <w:tc>
+          <w:tcPr>
+            <w:tcW w:type="dxa" w:w="4968"/>
+            <w:vAlign w:val="center"/>
+          </w:tcPr>
+          <w:p>
+            <w:r/>
+            <w:r>
+              <w:rPr>
+                <w:rFonts w:ascii="Aptos" w:hAnsi="Aptos"/>
+                <w:b w:val="0"/>
+                <w:color w:val="171717"/>
+                <w:sz w:val="20"/>
+              </w:rPr>
+              <w:t>Prepared and finalized the academic source report.</w:t>
+            </w:r>
+          </w:p>
+        </w:tc>
+      </w:tr>
+      <w:tr>
+        <w:tc>
+          <w:tcPr>
+            <w:tcW w:type="dxa" w:w="4968"/>
+            <w:vAlign w:val="center"/>
+          </w:tcPr>
+          <w:p>
+            <w:r/>
+            <w:r>
+              <w:rPr>
+                <w:rFonts w:ascii="Aptos" w:hAnsi="Aptos"/>
+                <w:b/>
+                <w:color w:val="171717"/>
+                <w:sz w:val="20"/>
+              </w:rPr>
               <w:t>AIML 500 course lesson</w:t>
             </w:r>
           </w:p>
@@ -649,6 +687,120 @@
                 <w:sz w:val="20"/>
               </w:rPr>
               <w:t>Supported the explanation of CNN-based face recognition and learned embeddings.</w:t>
+            </w:r>
+          </w:p>
+        </w:tc>
+      </w:tr>
+      <w:tr>
+        <w:tc>
+          <w:tcPr>
+            <w:tcW w:type="dxa" w:w="4968"/>
+            <w:vAlign w:val="center"/>
+          </w:tcPr>
+          <w:p>
+            <w:r/>
+            <w:r>
+              <w:rPr>
+                <w:rFonts w:ascii="Aptos" w:hAnsi="Aptos"/>
+                <w:b/>
+                <w:color w:val="171717"/>
+                <w:sz w:val="20"/>
+              </w:rPr>
+              <w:t>HTML and CSS</w:t>
+            </w:r>
+          </w:p>
+        </w:tc>
+        <w:tc>
+          <w:tcPr>
+            <w:tcW w:type="dxa" w:w="4968"/>
+            <w:vAlign w:val="center"/>
+          </w:tcPr>
+          <w:p>
+            <w:r/>
+            <w:r>
+              <w:rPr>
+                <w:rFonts w:ascii="Aptos" w:hAnsi="Aptos"/>
+                <w:b w:val="0"/>
+                <w:color w:val="171717"/>
+                <w:sz w:val="20"/>
+              </w:rPr>
+              <w:t>Presented the artifact in a clear, responsive professional layout.</w:t>
+            </w:r>
+          </w:p>
+        </w:tc>
+      </w:tr>
+      <w:tr>
+        <w:tc>
+          <w:tcPr>
+            <w:tcW w:type="dxa" w:w="4968"/>
+            <w:vAlign w:val="center"/>
+          </w:tcPr>
+          <w:p>
+            <w:r/>
+            <w:r>
+              <w:rPr>
+                <w:rFonts w:ascii="Aptos" w:hAnsi="Aptos"/>
+                <w:b/>
+                <w:color w:val="171717"/>
+                <w:sz w:val="20"/>
+              </w:rPr>
+              <w:t>GitHub Pages</w:t>
+            </w:r>
+          </w:p>
+        </w:tc>
+        <w:tc>
+          <w:tcPr>
+            <w:tcW w:type="dxa" w:w="4968"/>
+            <w:vAlign w:val="center"/>
+          </w:tcPr>
+          <w:p>
+            <w:r/>
+            <w:r>
+              <w:rPr>
+                <w:rFonts w:ascii="Aptos" w:hAnsi="Aptos"/>
+                <w:b w:val="0"/>
+                <w:color w:val="171717"/>
+                <w:sz w:val="20"/>
+              </w:rPr>
+              <w:t>Published the artifact and supporting documents at a stable public URL.</w:t>
+            </w:r>
+          </w:p>
+        </w:tc>
+      </w:tr>
+      <w:tr>
+        <w:tc>
+          <w:tcPr>
+            <w:tcW w:type="dxa" w:w="4968"/>
+            <w:vAlign w:val="center"/>
+          </w:tcPr>
+          <w:p>
+            <w:r/>
+            <w:r>
+              <w:rPr>
+                <w:rFonts w:ascii="Aptos" w:hAnsi="Aptos"/>
+                <w:b/>
+                <w:color w:val="171717"/>
+                <w:sz w:val="20"/>
+              </w:rPr>
+              <w:t>Desktop and mobile browser testing</w:t>
+            </w:r>
+          </w:p>
+        </w:tc>
+        <w:tc>
+          <w:tcPr>
+            <w:tcW w:type="dxa" w:w="4968"/>
+            <w:vAlign w:val="center"/>
+          </w:tcPr>
+          <w:p>
+            <w:r/>
+            <w:r>
+              <w:rPr>
+                <w:rFonts w:ascii="Aptos" w:hAnsi="Aptos"/>
+                <w:b w:val="0"/>
+                <w:color w:val="171717"/>
+                <w:sz w:val="20"/>
+              </w:rPr>
+              <w:t>Verified page behavior, links, images, layout, and console status.</w:t>
             </w:r>
           </w:p>
         </w:tc>
@@ -849,6 +1001,14 @@
         <w:pStyle w:val="ListBullet"/>
       </w:pPr>
       <w:r>
+        <w:t>Researching, citing, and qualifying technical claims.</w:t>
+      </w:r>
+    </w:p>
+    <w:p>
+      <w:pPr>
+        <w:pStyle w:val="ListBullet"/>
+      </w:pPr>
+      <w:r>
         <w:t>Revising academic work for a professional portfolio audience.</w:t>
       </w:r>
     </w:p>
@@ -858,6 +1018,54 @@
       </w:pPr>
       <w:r>
         <w:t>Publishing and testing a responsive web artifact.</w:t>
+      </w:r>
+    </w:p>
+    <w:p>
+      <w:pPr>
+        <w:jc w:val="center"/>
+      </w:pPr>
+      <w:r>
+        <w:drawing>
+          <wp:inline xmlns:a="http://schemas.openxmlformats.org/drawingml/2006/main" xmlns:pic="http://schemas.openxmlformats.org/drawingml/2006/picture">
+            <wp:extent cx="5897880" cy="2402840"/>
+            <wp:docPr id="2" name="Picture 2"/>
+            <wp:cNvGraphicFramePr>
+              <a:graphicFrameLocks noChangeAspect="1"/>
+            </wp:cNvGraphicFramePr>
+            <a:graphic>
+              <a:graphicData uri="http://schemas.openxmlformats.org/drawingml/2006/picture">
+                <pic:pic>
+                  <pic:nvPicPr>
+                    <pic:cNvPr id="0" name="skills-demonstrated.jpg"/>
+                    <pic:cNvPicPr/>
+                  </pic:nvPicPr>
+                  <pic:blipFill>
+                    <a:blip r:embed="rId12"/>
+                    <a:stretch>
+                      <a:fillRect/>
+                    </a:stretch>
+                  </pic:blipFill>
+                  <pic:spPr>
+                    <a:xfrm>
+                      <a:off x="0" y="0"/>
+                      <a:ext cx="5897880" cy="2402840"/>
+                    </a:xfrm>
+                    <a:prstGeom prst="rect"/>
+                  </pic:spPr>
+                </pic:pic>
+              </a:graphicData>
+            </a:graphic>
+          </wp:inline>
+        </w:drawing>
+      </w:r>
+    </w:p>
+    <w:p>
+      <w:pPr>
+        <w:pStyle w:val="Caption"/>
+        <w:jc w:val="center"/>
+      </w:pPr>
+      <w:r>
+        <w:t>Figure 2. Skills demonstrated section on the published Artifact 2 page.</w:t>
       </w:r>
     </w:p>
     <w:p>
@@ -927,6 +1135,137 @@
       <w:pPr/>
       <w:r>
         <w:t>A long academic report is useful as evidence but is not always easy to scan online. I retained the full report as a supporting download and built a shorter web presentation that surfaces the objective, key comparison, applications, skills, challenges, and lessons learned.</w:t>
+      </w:r>
+    </w:p>
+    <w:p>
+      <w:pPr>
+        <w:pStyle w:val="Heading1"/>
+      </w:pPr>
+      <w:r>
+        <w:t>Tangible Evidence</w:t>
+      </w:r>
+    </w:p>
+    <w:p>
+      <w:pPr/>
+      <w:r>
+        <w:t>The published page, report, and screenshots below provide direct evidence of the completed work. The final report contains the two case studies, detailed comparison, in-text citations, conclusion, and references. The web artifact presents the same core learning in a concise professional format.</w:t>
+      </w:r>
+    </w:p>
+    <w:p>
+      <w:pPr>
+        <w:jc w:val="center"/>
+      </w:pPr>
+      <w:r>
+        <w:drawing>
+          <wp:inline xmlns:a="http://schemas.openxmlformats.org/drawingml/2006/main" xmlns:pic="http://schemas.openxmlformats.org/drawingml/2006/picture">
+            <wp:extent cx="5897880" cy="1760894"/>
+            <wp:docPr id="3" name="Picture 3"/>
+            <wp:cNvGraphicFramePr>
+              <a:graphicFrameLocks noChangeAspect="1"/>
+            </wp:cNvGraphicFramePr>
+            <a:graphic>
+              <a:graphicData uri="http://schemas.openxmlformats.org/drawingml/2006/picture">
+                <pic:pic>
+                  <pic:nvPicPr>
+                    <pic:cNvPr id="0" name="artifact-2-live-page.jpg"/>
+                    <pic:cNvPicPr/>
+                  </pic:nvPicPr>
+                  <pic:blipFill>
+                    <a:blip r:embed="rId13"/>
+                    <a:stretch>
+                      <a:fillRect/>
+                    </a:stretch>
+                  </pic:blipFill>
+                  <pic:spPr>
+                    <a:xfrm>
+                      <a:off x="0" y="0"/>
+                      <a:ext cx="5897880" cy="1760894"/>
+                    </a:xfrm>
+                    <a:prstGeom prst="rect"/>
+                  </pic:spPr>
+                </pic:pic>
+              </a:graphicData>
+            </a:graphic>
+          </wp:inline>
+        </w:drawing>
+      </w:r>
+    </w:p>
+    <w:p>
+      <w:pPr>
+        <w:pStyle w:val="Caption"/>
+        <w:jc w:val="center"/>
+      </w:pPr>
+      <w:r>
+        <w:t>Figure 3. Published Artifact 2 page with title, overview, navigation, and report link.</w:t>
+      </w:r>
+    </w:p>
+    <w:p>
+      <w:r>
+        <w:br w:type="page"/>
+      </w:r>
+    </w:p>
+    <w:p>
+      <w:pPr>
+        <w:pStyle w:val="Heading1"/>
+      </w:pPr>
+      <w:r>
+        <w:t>Reflection</w:t>
+      </w:r>
+    </w:p>
+    <w:p>
+      <w:pPr>
+        <w:pStyle w:val="Heading2"/>
+      </w:pPr>
+      <w:r>
+        <w:t>Customization for the Audience</w:t>
+      </w:r>
+    </w:p>
+    <w:p>
+      <w:pPr/>
+      <w:r>
+        <w:t>I learned that a portfolio artifact must do more than reproduce a class submission. The academic report provides depth, but the public page needs a visible purpose, quick navigation, concise explanations, evidence, and a clear statement of skills. I therefore retained the report as supporting evidence while designing the web page for faster review by an instructor or professional audience.</w:t>
+      </w:r>
+    </w:p>
+    <w:p>
+      <w:pPr>
+        <w:pStyle w:val="Heading2"/>
+      </w:pPr>
+      <w:r>
+        <w:t>Lessons Learned</w:t>
+      </w:r>
+    </w:p>
+    <w:p>
+      <w:pPr/>
+      <w:r>
+        <w:t>The main technical lesson was that greater model complexity does not automatically produce a better solution. Logistic regression is valuable when inputs can be structured and the output is binary, while CNNs are valuable when useful visual features must be learned from raw data. I also learned that technical communication requires careful boundaries: a real product may illustrate an application, but that does not prove which exact model runs inside it.</w:t>
+      </w:r>
+    </w:p>
+    <w:p>
+      <w:pPr>
+        <w:pStyle w:val="Heading2"/>
+      </w:pPr>
+      <w:r>
+        <w:t>Review Input and Revisions</w:t>
+      </w:r>
+    </w:p>
+    <w:p>
+      <w:pPr/>
+      <w:r>
+        <w:t>No formal instructor feedback had been received when this portfolio version was completed. I therefore used the assignment instructions, rubric criteria, source verification, and structured self-review as revision inputs. Those checks led me to make the artifact’s title, objective, process, tools, value proposition, evidence, audience customization, lessons, challenges, and revisions explicit. I also added direct links to both the documentation and the finalized report and tested the live page at desktop and mobile sizes.</w:t>
+      </w:r>
+    </w:p>
+    <w:p>
+      <w:pPr>
+        <w:pStyle w:val="Heading2"/>
+      </w:pPr>
+      <w:r>
+        <w:t>Future Improvements</w:t>
+      </w:r>
+    </w:p>
+    <w:p>
+      <w:pPr/>
+      <w:r>
+        <w:t>A future revision could add a small original dataset demonstration, train baseline logistic-regression and CNN models, report evaluation metrics, and compare performance, resource use, and error patterns. That would extend the artifact from a concept-and-application comparison into an empirical model comparison while preserving the current explanation as context.</w:t>
       </w:r>
     </w:p>
     <w:p>

</xml_diff>